<commit_message>
EDA: data loading and fraud distribution analysis
</commit_message>
<xml_diff>
--- a/credit-fraud-roadmap.docx
+++ b/credit-fraud-roadmap.docx
@@ -64,7 +64,27 @@
           <w:color w:val="2E75B6"/>
           <w:lang w:val="en-US"/>
         </w:rPr>
-        <w:t>ML + Deep Learning · IEEE-CIS Dataset · Jupyter + Git</w:t>
+        <w:t xml:space="preserve">ML + Deep Learning · IEEE-CIS Dataset · </w:t>
+      </w:r>
+      <w:proofErr w:type="spellStart"/>
+      <w:r>
+        <w:rPr>
+          <w:i/>
+          <w:iCs/>
+          <w:color w:val="2E75B6"/>
+          <w:lang w:val="en-US"/>
+        </w:rPr>
+        <w:t>Jupyter</w:t>
+      </w:r>
+      <w:proofErr w:type="spellEnd"/>
+      <w:r>
+        <w:rPr>
+          <w:i/>
+          <w:iCs/>
+          <w:color w:val="2E75B6"/>
+          <w:lang w:val="en-US"/>
+        </w:rPr>
+        <w:t xml:space="preserve"> + Git</w:t>
       </w:r>
     </w:p>
     <w:p>
@@ -1296,8 +1316,21 @@
                 <w:szCs w:val="24"/>
                 <w:lang w:val="en-US"/>
               </w:rPr>
-              <w:t>Notebook 03 — Machine Learning clásico</w:t>
-            </w:r>
+              <w:t xml:space="preserve">Notebook 03 — Machine Learning </w:t>
+            </w:r>
+            <w:proofErr w:type="spellStart"/>
+            <w:r>
+              <w:rPr>
+                <w:b/>
+                <w:bCs/>
+                <w:color w:val="1F4E79"/>
+                <w:sz w:val="24"/>
+                <w:szCs w:val="24"/>
+                <w:lang w:val="en-US"/>
+              </w:rPr>
+              <w:t>clásico</w:t>
+            </w:r>
+            <w:proofErr w:type="spellEnd"/>
           </w:p>
           <w:p>
             <w:pPr>
@@ -1312,7 +1345,67 @@
                 <w:szCs w:val="20"/>
                 <w:lang w:val="en-US"/>
               </w:rPr>
-              <w:t>Random Forest · XGBoost · LightGBM · métricas · SMOTE</w:t>
+              <w:t xml:space="preserve">Random Forest · </w:t>
+            </w:r>
+            <w:proofErr w:type="spellStart"/>
+            <w:r>
+              <w:rPr>
+                <w:color w:val="555555"/>
+                <w:sz w:val="20"/>
+                <w:szCs w:val="20"/>
+                <w:lang w:val="en-US"/>
+              </w:rPr>
+              <w:t>XGBoost</w:t>
+            </w:r>
+            <w:proofErr w:type="spellEnd"/>
+            <w:r>
+              <w:rPr>
+                <w:color w:val="555555"/>
+                <w:sz w:val="20"/>
+                <w:szCs w:val="20"/>
+                <w:lang w:val="en-US"/>
+              </w:rPr>
+              <w:t xml:space="preserve"> · </w:t>
+            </w:r>
+            <w:proofErr w:type="spellStart"/>
+            <w:r>
+              <w:rPr>
+                <w:color w:val="555555"/>
+                <w:sz w:val="20"/>
+                <w:szCs w:val="20"/>
+                <w:lang w:val="en-US"/>
+              </w:rPr>
+              <w:t>LightGBM</w:t>
+            </w:r>
+            <w:proofErr w:type="spellEnd"/>
+            <w:r>
+              <w:rPr>
+                <w:color w:val="555555"/>
+                <w:sz w:val="20"/>
+                <w:szCs w:val="20"/>
+                <w:lang w:val="en-US"/>
+              </w:rPr>
+              <w:t xml:space="preserve"> · </w:t>
+            </w:r>
+            <w:proofErr w:type="spellStart"/>
+            <w:r>
+              <w:rPr>
+                <w:color w:val="555555"/>
+                <w:sz w:val="20"/>
+                <w:szCs w:val="20"/>
+                <w:lang w:val="en-US"/>
+              </w:rPr>
+              <w:t>métricas</w:t>
+            </w:r>
+            <w:proofErr w:type="spellEnd"/>
+            <w:r>
+              <w:rPr>
+                <w:color w:val="555555"/>
+                <w:sz w:val="20"/>
+                <w:szCs w:val="20"/>
+                <w:lang w:val="en-US"/>
+              </w:rPr>
+              <w:t xml:space="preserve"> · SMOTE</w:t>
             </w:r>
           </w:p>
         </w:tc>
@@ -1432,7 +1525,27 @@
                 <w:szCs w:val="20"/>
                 <w:lang w:val="en-US"/>
               </w:rPr>
-              <w:t>Red neuronal con PyTorch · Batch Norm · Dropout · Embeddings</w:t>
+              <w:t xml:space="preserve">Red neuronal con </w:t>
+            </w:r>
+            <w:proofErr w:type="spellStart"/>
+            <w:r>
+              <w:rPr>
+                <w:color w:val="555555"/>
+                <w:sz w:val="20"/>
+                <w:szCs w:val="20"/>
+                <w:lang w:val="en-US"/>
+              </w:rPr>
+              <w:t>PyTorch</w:t>
+            </w:r>
+            <w:proofErr w:type="spellEnd"/>
+            <w:r>
+              <w:rPr>
+                <w:color w:val="555555"/>
+                <w:sz w:val="20"/>
+                <w:szCs w:val="20"/>
+                <w:lang w:val="en-US"/>
+              </w:rPr>
+              <w:t xml:space="preserve"> · Batch Norm · Dropout · Embeddings</w:t>
             </w:r>
           </w:p>
         </w:tc>
@@ -1579,7 +1692,63 @@
         <w:rPr>
           <w:lang w:val="en-US"/>
         </w:rPr>
-        <w:t>Usar commits semánticos: feat:, fix:, docs:, chore:</w:t>
+        <w:t xml:space="preserve">Usar commits </w:t>
+      </w:r>
+      <w:proofErr w:type="spellStart"/>
+      <w:r>
+        <w:rPr>
+          <w:lang w:val="en-US"/>
+        </w:rPr>
+        <w:t>semánticos</w:t>
+      </w:r>
+      <w:proofErr w:type="spellEnd"/>
+      <w:r>
+        <w:rPr>
+          <w:lang w:val="en-US"/>
+        </w:rPr>
+        <w:t xml:space="preserve">: </w:t>
+      </w:r>
+      <w:proofErr w:type="gramStart"/>
+      <w:r>
+        <w:rPr>
+          <w:lang w:val="en-US"/>
+        </w:rPr>
+        <w:t>feat:,</w:t>
+      </w:r>
+      <w:proofErr w:type="gramEnd"/>
+      <w:r>
+        <w:rPr>
+          <w:lang w:val="en-US"/>
+        </w:rPr>
+        <w:t xml:space="preserve"> </w:t>
+      </w:r>
+      <w:proofErr w:type="gramStart"/>
+      <w:r>
+        <w:rPr>
+          <w:lang w:val="en-US"/>
+        </w:rPr>
+        <w:t>fix:,</w:t>
+      </w:r>
+      <w:proofErr w:type="gramEnd"/>
+      <w:r>
+        <w:rPr>
+          <w:lang w:val="en-US"/>
+        </w:rPr>
+        <w:t xml:space="preserve"> </w:t>
+      </w:r>
+      <w:proofErr w:type="gramStart"/>
+      <w:r>
+        <w:rPr>
+          <w:lang w:val="en-US"/>
+        </w:rPr>
+        <w:t>docs:,</w:t>
+      </w:r>
+      <w:proofErr w:type="gramEnd"/>
+      <w:r>
+        <w:rPr>
+          <w:lang w:val="en-US"/>
+        </w:rPr>
+        <w:t xml:space="preserve"> chore:</w:t>
       </w:r>
     </w:p>
     <w:p>
@@ -1671,11 +1840,33 @@
           <w:lang w:val="en-US"/>
         </w:rPr>
       </w:pPr>
+      <w:proofErr w:type="spellStart"/>
       <w:r>
         <w:rPr>
           <w:lang w:val="en-US"/>
         </w:rPr>
-        <w:t>Obtener API key desde kaggle.com/settings</w:t>
+        <w:t>Obtener</w:t>
+      </w:r>
+      <w:proofErr w:type="spellEnd"/>
+      <w:r>
+        <w:rPr>
+          <w:lang w:val="en-US"/>
+        </w:rPr>
+        <w:t xml:space="preserve"> API key </w:t>
+      </w:r>
+      <w:proofErr w:type="spellStart"/>
+      <w:r>
+        <w:rPr>
+          <w:lang w:val="en-US"/>
+        </w:rPr>
+        <w:t>desde</w:t>
+      </w:r>
+      <w:proofErr w:type="spellEnd"/>
+      <w:r>
+        <w:rPr>
+          <w:lang w:val="en-US"/>
+        </w:rPr>
+        <w:t xml:space="preserve"> kaggle.com/settings</w:t>
       </w:r>
     </w:p>
     <w:p>
@@ -3434,6 +3625,7 @@
       <w:pPr>
         <w:spacing w:before="200"/>
         <w:rPr>
+          <w:u w:val="single"/>
           <w:lang w:val="en-US"/>
         </w:rPr>
       </w:pPr>

</xml_diff>